<commit_message>
corregido template correcto al crear ot
</commit_message>
<xml_diff>
--- a/public/templates/template_reubicacion.docx
+++ b/public/templates/template_reubicacion.docx
@@ -31,7 +31,7 @@
           <w:sz w:val="20"/>
         </w:rPr>
         <w:drawing>
-          <wp:inline distT="0" distB="0" distL="0" distR="0" wp14:anchorId="58908E5F" wp14:editId="3CB2B4AB">
+          <wp:inline distT="0" distB="0" distL="0" distR="0" wp14:anchorId="21CE6DAD" wp14:editId="07523F19">
             <wp:extent cx="2418587" cy="327660"/>
             <wp:effectExtent l="0" t="0" r="0" b="0"/>
             <wp:docPr id="1" name="Image 1"/>
@@ -83,7 +83,7 @@
         <mc:AlternateContent>
           <mc:Choice Requires="wps">
             <w:drawing>
-              <wp:inline distT="0" distB="0" distL="0" distR="0" wp14:anchorId="2EC9DC03" wp14:editId="110A3B68">
+              <wp:inline distT="0" distB="0" distL="0" distR="0" wp14:anchorId="794B4CDD" wp14:editId="58D0AF9F">
                 <wp:extent cx="2072639" cy="198120"/>
                 <wp:effectExtent l="0" t="0" r="0" b="0"/>
                 <wp:docPr id="2" name="Textbox 2"/>
@@ -257,7 +257,7 @@
           </mc:Choice>
           <mc:Fallback>
             <w:pict>
-              <v:shapetype w14:anchorId="2EC9DC03" id="_x0000_t202" coordsize="21600,21600" o:spt="202" path="m,l,21600r21600,l21600,xe">
+              <v:shapetype w14:anchorId="794B4CDD" id="_x0000_t202" coordsize="21600,21600" o:spt="202" path="m,l,21600r21600,l21600,xe">
                 <v:stroke joinstyle="miter"/>
                 <v:path gradientshapeok="t" o:connecttype="rect"/>
               </v:shapetype>
@@ -602,7 +602,7 @@
         <mc:AlternateContent>
           <mc:Choice Requires="wps">
             <w:drawing>
-              <wp:anchor distT="0" distB="0" distL="0" distR="0" simplePos="0" relativeHeight="15729152" behindDoc="0" locked="0" layoutInCell="1" allowOverlap="1" wp14:anchorId="5095AFDD" wp14:editId="19889C23">
+              <wp:anchor distT="0" distB="0" distL="0" distR="0" simplePos="0" relativeHeight="15729152" behindDoc="0" locked="0" layoutInCell="1" allowOverlap="1" wp14:anchorId="58EE51FC" wp14:editId="49CC079D">
                 <wp:simplePos x="0" y="0"/>
                 <wp:positionH relativeFrom="page">
                   <wp:posOffset>5902452</wp:posOffset>
@@ -773,7 +773,7 @@
           </mc:Choice>
           <mc:Fallback>
             <w:pict>
-              <v:shape w14:anchorId="5095AFDD" id="Textbox 3" o:spid="_x0000_s1027" type="#_x0000_t202" style="position:absolute;left:0;text-align:left;margin-left:464.75pt;margin-top:2.55pt;width:204.85pt;height:22.85pt;z-index:15729152;visibility:visible;mso-wrap-style:square;mso-wrap-distance-left:0;mso-wrap-distance-top:0;mso-wrap-distance-right:0;mso-wrap-distance-bottom:0;mso-position-horizontal:absolute;mso-position-horizontal-relative:page;mso-position-vertical:absolute;mso-position-vertical-relative:text;v-text-anchor:top" o:gfxdata="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" filled="f" stroked="f">
+              <v:shape w14:anchorId="58EE51FC" id="Textbox 3" o:spid="_x0000_s1027" type="#_x0000_t202" style="position:absolute;left:0;text-align:left;margin-left:464.75pt;margin-top:2.55pt;width:204.85pt;height:22.85pt;z-index:15729152;visibility:visible;mso-wrap-style:square;mso-wrap-distance-left:0;mso-wrap-distance-top:0;mso-wrap-distance-right:0;mso-wrap-distance-bottom:0;mso-position-horizontal:absolute;mso-position-horizontal-relative:page;mso-position-vertical:absolute;mso-position-vertical-relative:text;v-text-anchor:top" o:gfxdata="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" filled="f" stroked="f">
                 <v:textbox inset="0,0,0,0">
                   <w:txbxContent>
                     <w:tbl>
@@ -2816,6 +2816,7 @@
         </w:rPr>
         <w:t xml:space="preserve"> </w:t>
       </w:r>
+      <w:proofErr w:type="gramStart"/>
       <w:r>
         <w:rPr>
           <w:b/>
@@ -2829,8 +2830,16 @@
           <w:spacing w:val="-5"/>
           <w:sz w:val="15"/>
         </w:rPr>
+        <w:t xml:space="preserve"> </w:t>
+      </w:r>
+      <w:r>
+        <w:rPr>
+          <w:b/>
+          <w:sz w:val="15"/>
+        </w:rPr>
         <w:t>)</w:t>
       </w:r>
+      <w:proofErr w:type="gramEnd"/>
       <w:r>
         <w:rPr>
           <w:b/>
@@ -4726,7 +4735,7 @@
         <mc:AlternateContent>
           <mc:Choice Requires="wpg">
             <w:drawing>
-              <wp:anchor distT="0" distB="0" distL="0" distR="0" simplePos="0" relativeHeight="487587840" behindDoc="1" locked="0" layoutInCell="1" allowOverlap="1" wp14:anchorId="28DA9EF1" wp14:editId="66104E2D">
+              <wp:anchor distT="0" distB="0" distL="0" distR="0" simplePos="0" relativeHeight="487587840" behindDoc="1" locked="0" layoutInCell="1" allowOverlap="1" wp14:anchorId="334CEE6C" wp14:editId="29637DA7">
                 <wp:simplePos x="0" y="0"/>
                 <wp:positionH relativeFrom="page">
                   <wp:posOffset>1601724</wp:posOffset>
@@ -4874,23 +4883,68 @@
                                   <w:b/>
                                   <w:sz w:val="15"/>
                                 </w:rPr>
-                                <w:t>{{</w:t>
+                                <w:t>ÁREA</w:t>
                               </w:r>
-                              <w:proofErr w:type="spellStart"/>
+                              <w:r>
+                                <w:rPr>
+                                  <w:b/>
+                                  <w:spacing w:val="12"/>
+                                  <w:sz w:val="15"/>
+                                </w:rPr>
+                                <w:t xml:space="preserve"> </w:t>
+                              </w:r>
                               <w:r>
                                 <w:rPr>
                                   <w:b/>
                                   <w:sz w:val="15"/>
                                 </w:rPr>
-                                <w:t>firma_area_usuaria</w:t>
+                                <w:t>USUARIA</w:t>
                               </w:r>
-                              <w:proofErr w:type="spellEnd"/>
+                              <w:r>
+                                <w:rPr>
+                                  <w:b/>
+                                  <w:spacing w:val="12"/>
+                                  <w:sz w:val="15"/>
+                                </w:rPr>
+                                <w:t xml:space="preserve"> </w:t>
+                              </w:r>
                               <w:r>
                                 <w:rPr>
                                   <w:b/>
                                   <w:sz w:val="15"/>
                                 </w:rPr>
-                                <w:t>}}</w:t>
+                                <w:t>-</w:t>
+                              </w:r>
+                              <w:r>
+                                <w:rPr>
+                                  <w:b/>
+                                  <w:spacing w:val="14"/>
+                                  <w:sz w:val="15"/>
+                                </w:rPr>
+                                <w:t xml:space="preserve"> </w:t>
+                              </w:r>
+                              <w:r>
+                                <w:rPr>
+                                  <w:b/>
+                                  <w:sz w:val="15"/>
+                                </w:rPr>
+                                <w:t>ELECTROPUNO</w:t>
+                              </w:r>
+                              <w:r>
+                                <w:rPr>
+                                  <w:b/>
+                                  <w:spacing w:val="14"/>
+                                  <w:sz w:val="15"/>
+                                </w:rPr>
+                                <w:t xml:space="preserve"> </w:t>
+                              </w:r>
+                              <w:r>
+                                <w:rPr>
+                                  <w:b/>
+                                  <w:spacing w:val="-2"/>
+                                  <w:sz w:val="15"/>
+                                </w:rPr>
+                                <w:t>S.A.A.</w:t>
                               </w:r>
                             </w:p>
                           </w:txbxContent>
@@ -4926,23 +4980,68 @@
                                   <w:b/>
                                   <w:sz w:val="15"/>
                                 </w:rPr>
-                                <w:t>{{</w:t>
+                                <w:t>COORDINADOR</w:t>
                               </w:r>
-                              <w:proofErr w:type="spellStart"/>
+                              <w:r>
+                                <w:rPr>
+                                  <w:b/>
+                                  <w:spacing w:val="17"/>
+                                  <w:sz w:val="15"/>
+                                </w:rPr>
+                                <w:t xml:space="preserve"> </w:t>
+                              </w:r>
                               <w:r>
                                 <w:rPr>
                                   <w:b/>
                                   <w:sz w:val="15"/>
                                 </w:rPr>
-                                <w:t>firma_coordinador</w:t>
+                                <w:t>GENERAL</w:t>
                               </w:r>
-                              <w:proofErr w:type="spellEnd"/>
+                              <w:r>
+                                <w:rPr>
+                                  <w:b/>
+                                  <w:spacing w:val="15"/>
+                                  <w:sz w:val="15"/>
+                                </w:rPr>
+                                <w:t xml:space="preserve"> </w:t>
+                              </w:r>
                               <w:r>
                                 <w:rPr>
                                   <w:b/>
                                   <w:sz w:val="15"/>
                                 </w:rPr>
-                                <w:t>}}</w:t>
+                                <w:t>-</w:t>
+                              </w:r>
+                              <w:r>
+                                <w:rPr>
+                                  <w:b/>
+                                  <w:spacing w:val="18"/>
+                                  <w:sz w:val="15"/>
+                                </w:rPr>
+                                <w:t xml:space="preserve"> </w:t>
+                              </w:r>
+                              <w:r>
+                                <w:rPr>
+                                  <w:b/>
+                                  <w:sz w:val="15"/>
+                                </w:rPr>
+                                <w:t>CONSORCIO</w:t>
+                              </w:r>
+                              <w:r>
+                                <w:rPr>
+                                  <w:b/>
+                                  <w:spacing w:val="18"/>
+                                  <w:sz w:val="15"/>
+                                </w:rPr>
+                                <w:t xml:space="preserve"> </w:t>
+                              </w:r>
+                              <w:r>
+                                <w:rPr>
+                                  <w:b/>
+                                  <w:spacing w:val="-2"/>
+                                  <w:sz w:val="15"/>
+                                </w:rPr>
+                                <w:t>SUPERVISOR</w:t>
                               </w:r>
                             </w:p>
                           </w:txbxContent>
@@ -4980,23 +5079,37 @@
                                   <w:b/>
                                   <w:sz w:val="15"/>
                                 </w:rPr>
-                                <w:t>{{</w:t>
+                                <w:t>COORDINADOR</w:t>
                               </w:r>
-                              <w:proofErr w:type="spellStart"/>
+                              <w:r>
+                                <w:rPr>
+                                  <w:b/>
+                                  <w:spacing w:val="14"/>
+                                  <w:sz w:val="15"/>
+                                </w:rPr>
+                                <w:t xml:space="preserve"> </w:t>
+                              </w:r>
                               <w:r>
                                 <w:rPr>
                                   <w:b/>
                                   <w:sz w:val="15"/>
                                 </w:rPr>
-                                <w:t>firma_supervisor</w:t>
+                                <w:t>GENERAL</w:t>
                               </w:r>
-                              <w:proofErr w:type="spellEnd"/>
+                              <w:r>
+                                <w:rPr>
+                                  <w:b/>
+                                  <w:spacing w:val="14"/>
+                                  <w:sz w:val="15"/>
+                                </w:rPr>
+                                <w:t xml:space="preserve"> </w:t>
+                              </w:r>
                               <w:r>
                                 <w:rPr>
                                   <w:b/>
                                   <w:sz w:val="15"/>
                                 </w:rPr>
-                                <w:t>}}</w:t>
+                                <w:t>-</w:t>
                               </w:r>
                               <w:r>
                                 <w:rPr>
@@ -5011,38 +5124,23 @@
                                   <w:b/>
                                   <w:sz w:val="15"/>
                                 </w:rPr>
-                                <w:t>Consorcio</w:t>
+                                <w:t>{{</w:t>
                               </w:r>
-                              <w:r>
-                                <w:rPr>
-                                  <w:b/>
-                                  <w:spacing w:val="15"/>
-                                  <w:sz w:val="15"/>
-                                </w:rPr>
-                                <w:t xml:space="preserve"> </w:t>
-                              </w:r>
+                              <w:proofErr w:type="spellStart"/>
                               <w:r>
                                 <w:rPr>
                                   <w:b/>
                                   <w:sz w:val="15"/>
                                 </w:rPr>
-                                <w:t>San</w:t>
+                                <w:t>nombre_contratista</w:t>
                               </w:r>
+                              <w:proofErr w:type="spellEnd"/>
                               <w:r>
                                 <w:rPr>
                                   <w:b/>
-                                  <w:spacing w:val="15"/>
                                   <w:sz w:val="15"/>
                                 </w:rPr>
-                                <w:t xml:space="preserve"> </w:t>
-                              </w:r>
-                              <w:r>
-                                <w:rPr>
-                                  <w:b/>
-                                  <w:spacing w:val="-2"/>
-                                  <w:sz w:val="15"/>
-                                </w:rPr>
-                                <w:t>Pedro-</w:t>
+                                <w:t>}}</w:t>
                               </w:r>
                             </w:p>
                             <w:p>
@@ -5096,7 +5194,7 @@
           </mc:Choice>
           <mc:Fallback>
             <w:pict>
-              <v:group w14:anchorId="28DA9EF1" id="Group 4" o:spid="_x0000_s1028" style="position:absolute;margin-left:126.1pt;margin-top:23.3pt;width:540pt;height:19.35pt;z-index:-15728640;mso-wrap-distance-left:0;mso-wrap-distance-right:0;mso-position-horizontal-relative:page;mso-position-vertical-relative:text" coordsize="68580,2457" o:gfxdata="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">
+              <v:group w14:anchorId="334CEE6C" id="Group 4" o:spid="_x0000_s1028" style="position:absolute;margin-left:126.1pt;margin-top:23.3pt;width:540pt;height:19.35pt;z-index:-15728640;mso-wrap-distance-left:0;mso-wrap-distance-right:0;mso-position-horizontal-relative:page;mso-position-vertical-relative:text" coordsize="68580,2457" o:gfxdata="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">
                 <v:shape id="Graphic 5" o:spid="_x0000_s1029" style="position:absolute;left:45;top:30;width:68536;height:2426;visibility:visible;mso-wrap-style:square;v-text-anchor:top" coordsize="6853555,242570" o:gfxdata="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" path="m6853428,l,,,242315r6853428,l6853428,xe" fillcolor="#fce4d6" stroked="f">
                   <v:path arrowok="t"/>
                 </v:shape>
@@ -5119,23 +5217,68 @@
                             <w:b/>
                             <w:sz w:val="15"/>
                           </w:rPr>
-                          <w:t>{{</w:t>
+                          <w:t>ÁREA</w:t>
                         </w:r>
-                        <w:proofErr w:type="spellStart"/>
+                        <w:r>
+                          <w:rPr>
+                            <w:b/>
+                            <w:spacing w:val="12"/>
+                            <w:sz w:val="15"/>
+                          </w:rPr>
+                          <w:t xml:space="preserve"> </w:t>
+                        </w:r>
                         <w:r>
                           <w:rPr>
                             <w:b/>
                             <w:sz w:val="15"/>
                           </w:rPr>
-                          <w:t>firma_area_usuaria</w:t>
+                          <w:t>USUARIA</w:t>
                         </w:r>
-                        <w:proofErr w:type="spellEnd"/>
+                        <w:r>
+                          <w:rPr>
+                            <w:b/>
+                            <w:spacing w:val="12"/>
+                            <w:sz w:val="15"/>
+                          </w:rPr>
+                          <w:t xml:space="preserve"> </w:t>
+                        </w:r>
                         <w:r>
                           <w:rPr>
                             <w:b/>
                             <w:sz w:val="15"/>
                           </w:rPr>
-                          <w:t>}}</w:t>
+                          <w:t>-</w:t>
+                        </w:r>
+                        <w:r>
+                          <w:rPr>
+                            <w:b/>
+                            <w:spacing w:val="14"/>
+                            <w:sz w:val="15"/>
+                          </w:rPr>
+                          <w:t xml:space="preserve"> </w:t>
+                        </w:r>
+                        <w:r>
+                          <w:rPr>
+                            <w:b/>
+                            <w:sz w:val="15"/>
+                          </w:rPr>
+                          <w:t>ELECTROPUNO</w:t>
+                        </w:r>
+                        <w:r>
+                          <w:rPr>
+                            <w:b/>
+                            <w:spacing w:val="14"/>
+                            <w:sz w:val="15"/>
+                          </w:rPr>
+                          <w:t xml:space="preserve"> </w:t>
+                        </w:r>
+                        <w:r>
+                          <w:rPr>
+                            <w:b/>
+                            <w:spacing w:val="-2"/>
+                            <w:sz w:val="15"/>
+                          </w:rPr>
+                          <w:t>S.A.A.</w:t>
                         </w:r>
                       </w:p>
                     </w:txbxContent>
@@ -5157,23 +5300,68 @@
                             <w:b/>
                             <w:sz w:val="15"/>
                           </w:rPr>
-                          <w:t>{{</w:t>
+                          <w:t>COORDINADOR</w:t>
                         </w:r>
-                        <w:proofErr w:type="spellStart"/>
+                        <w:r>
+                          <w:rPr>
+                            <w:b/>
+                            <w:spacing w:val="17"/>
+                            <w:sz w:val="15"/>
+                          </w:rPr>
+                          <w:t xml:space="preserve"> </w:t>
+                        </w:r>
                         <w:r>
                           <w:rPr>
                             <w:b/>
                             <w:sz w:val="15"/>
                           </w:rPr>
-                          <w:t>firma_coordinador</w:t>
+                          <w:t>GENERAL</w:t>
                         </w:r>
-                        <w:proofErr w:type="spellEnd"/>
+                        <w:r>
+                          <w:rPr>
+                            <w:b/>
+                            <w:spacing w:val="15"/>
+                            <w:sz w:val="15"/>
+                          </w:rPr>
+                          <w:t xml:space="preserve"> </w:t>
+                        </w:r>
                         <w:r>
                           <w:rPr>
                             <w:b/>
                             <w:sz w:val="15"/>
                           </w:rPr>
-                          <w:t>}}</w:t>
+                          <w:t>-</w:t>
+                        </w:r>
+                        <w:r>
+                          <w:rPr>
+                            <w:b/>
+                            <w:spacing w:val="18"/>
+                            <w:sz w:val="15"/>
+                          </w:rPr>
+                          <w:t xml:space="preserve"> </w:t>
+                        </w:r>
+                        <w:r>
+                          <w:rPr>
+                            <w:b/>
+                            <w:sz w:val="15"/>
+                          </w:rPr>
+                          <w:t>CONSORCIO</w:t>
+                        </w:r>
+                        <w:r>
+                          <w:rPr>
+                            <w:b/>
+                            <w:spacing w:val="18"/>
+                            <w:sz w:val="15"/>
+                          </w:rPr>
+                          <w:t xml:space="preserve"> </w:t>
+                        </w:r>
+                        <w:r>
+                          <w:rPr>
+                            <w:b/>
+                            <w:spacing w:val="-2"/>
+                            <w:sz w:val="15"/>
+                          </w:rPr>
+                          <w:t>SUPERVISOR</w:t>
                         </w:r>
                       </w:p>
                     </w:txbxContent>
@@ -5197,23 +5385,37 @@
                             <w:b/>
                             <w:sz w:val="15"/>
                           </w:rPr>
-                          <w:t>{{</w:t>
+                          <w:t>COORDINADOR</w:t>
                         </w:r>
-                        <w:proofErr w:type="spellStart"/>
+                        <w:r>
+                          <w:rPr>
+                            <w:b/>
+                            <w:spacing w:val="14"/>
+                            <w:sz w:val="15"/>
+                          </w:rPr>
+                          <w:t xml:space="preserve"> </w:t>
+                        </w:r>
                         <w:r>
                           <w:rPr>
                             <w:b/>
                             <w:sz w:val="15"/>
                           </w:rPr>
-                          <w:t>firma_supervisor</w:t>
+                          <w:t>GENERAL</w:t>
                         </w:r>
-                        <w:proofErr w:type="spellEnd"/>
+                        <w:r>
+                          <w:rPr>
+                            <w:b/>
+                            <w:spacing w:val="14"/>
+                            <w:sz w:val="15"/>
+                          </w:rPr>
+                          <w:t xml:space="preserve"> </w:t>
+                        </w:r>
                         <w:r>
                           <w:rPr>
                             <w:b/>
                             <w:sz w:val="15"/>
                           </w:rPr>
-                          <w:t>}}</w:t>
+                          <w:t>-</w:t>
                         </w:r>
                         <w:r>
                           <w:rPr>
@@ -5228,38 +5430,23 @@
                             <w:b/>
                             <w:sz w:val="15"/>
                           </w:rPr>
-                          <w:t>Consorcio</w:t>
+                          <w:t>{{</w:t>
                         </w:r>
-                        <w:r>
-                          <w:rPr>
-                            <w:b/>
-                            <w:spacing w:val="15"/>
-                            <w:sz w:val="15"/>
-                          </w:rPr>
-                          <w:t xml:space="preserve"> </w:t>
-                        </w:r>
+                        <w:proofErr w:type="spellStart"/>
                         <w:r>
                           <w:rPr>
                             <w:b/>
                             <w:sz w:val="15"/>
                           </w:rPr>
-                          <w:t>San</w:t>
+                          <w:t>nombre_contratista</w:t>
                         </w:r>
+                        <w:proofErr w:type="spellEnd"/>
                         <w:r>
                           <w:rPr>
                             <w:b/>
-                            <w:spacing w:val="15"/>
                             <w:sz w:val="15"/>
                           </w:rPr>
-                          <w:t xml:space="preserve"> </w:t>
-                        </w:r>
-                        <w:r>
-                          <w:rPr>
-                            <w:b/>
-                            <w:spacing w:val="-2"/>
-                            <w:sz w:val="15"/>
-                          </w:rPr>
-                          <w:t>Pedro-</w:t>
+                          <w:t>}}</w:t>
                         </w:r>
                       </w:p>
                       <w:p>
@@ -5433,10 +5620,133 @@
 <file path=word/numbering.xml><?xml version="1.0" encoding="utf-8"?>
 <w:numbering xmlns:wpc="http://schemas.microsoft.com/office/word/2010/wordprocessingCanvas" xmlns:cx="http://schemas.microsoft.com/office/drawing/2014/chartex" xmlns:cx1="http://schemas.microsoft.com/office/drawing/2015/9/8/chartex" xmlns:cx2="http://schemas.microsoft.com/office/drawing/2015/10/21/chartex" xmlns:cx3="http://schemas.microsoft.com/office/drawing/2016/5/9/chartex" xmlns:cx4="http://schemas.microsoft.com/office/drawing/2016/5/10/chartex" xmlns:cx5="http://schemas.microsoft.com/office/drawing/2016/5/11/chartex" xmlns:cx6="http://schemas.microsoft.com/office/drawing/2016/5/12/chartex" xmlns:cx7="http://schemas.microsoft.com/office/drawing/2016/5/13/chartex" xmlns:cx8="http://schemas.microsoft.com/office/drawing/2016/5/14/chartex" xmlns:mc="http://schemas.openxmlformats.org/markup-compatibility/2006" xmlns:aink="http://schemas.microsoft.com/office/drawing/2016/ink" xmlns:am3d="http://schemas.microsoft.com/office/drawing/2017/model3d" xmlns:o="urn:schemas-microsoft-com:office:office" xmlns:r="http://schemas.openxmlformats.org/officeDocument/2006/relationships" xmlns:m="http://schemas.openxmlformats.org/officeDocument/2006/math" xmlns:v="urn:schemas-microsoft-com:vml" xmlns:wp14="http://schemas.microsoft.com/office/word/2010/wordprocessingDrawing" xmlns:wp="http://schemas.openxmlformats.org/drawingml/2006/wordprocessingDrawing" xmlns:w10="urn:schemas-microsoft-com:office:word" xmlns:w="http://schemas.openxmlformats.org/wordprocessingml/2006/main" xmlns:w14="http://schemas.microsoft.com/office/word/2010/wordml" xmlns:w15="http://schemas.microsoft.com/office/word/2012/wordml" xmlns:w16cex="http://schemas.microsoft.com/office/word/2018/wordml/cex" xmlns:w16cid="http://schemas.microsoft.com/office/word/2016/wordml/cid" xmlns:w16="http://schemas.microsoft.com/office/word/2018/wordml" xmlns:w16sdtdh="http://schemas.microsoft.com/office/word/2020/wordml/sdtdatahash" xmlns:w16se="http://schemas.microsoft.com/office/word/2015/wordml/symex" xmlns:wpg="http://schemas.microsoft.com/office/word/2010/wordprocessingGroup" xmlns:wpi="http://schemas.microsoft.com/office/word/2010/wordprocessingInk" xmlns:wne="http://schemas.microsoft.com/office/word/2006/wordml" xmlns:wps="http://schemas.microsoft.com/office/word/2010/wordprocessingShape" mc:Ignorable="w14 w15 w16se w16cid w16 w16cex w16sdtdh wp14">
   <w:abstractNum w:abstractNumId="0" w15:restartNumberingAfterBreak="0">
-    <w:nsid w:val="03DA77D9"/>
+    <w:nsid w:val="41093C81"/>
     <w:multiLevelType w:val="hybridMultilevel"/>
-    <w:tmpl w:val="3C3887D2"/>
-    <w:lvl w:ilvl="0" w:tplc="2B26DB6C">
+    <w:tmpl w:val="B9BAA124"/>
+    <w:lvl w:ilvl="0" w:tplc="5D026878">
+      <w:start w:val="1"/>
+      <w:numFmt w:val="decimal"/>
+      <w:lvlText w:val="(%1)"/>
+      <w:lvlJc w:val="left"/>
+      <w:pPr>
+        <w:ind w:left="388" w:hanging="199"/>
+        <w:jc w:val="left"/>
+      </w:pPr>
+      <w:rPr>
+        <w:rFonts w:ascii="Calibri" w:eastAsia="Calibri" w:hAnsi="Calibri" w:cs="Calibri" w:hint="default"/>
+        <w:b w:val="0"/>
+        <w:bCs w:val="0"/>
+        <w:i w:val="0"/>
+        <w:iCs w:val="0"/>
+        <w:spacing w:val="-1"/>
+        <w:w w:val="99"/>
+        <w:sz w:val="15"/>
+        <w:szCs w:val="15"/>
+        <w:lang w:val="es-ES" w:eastAsia="en-US" w:bidi="ar-SA"/>
+      </w:rPr>
+    </w:lvl>
+    <w:lvl w:ilvl="1" w:tplc="2F620E48">
+      <w:numFmt w:val="bullet"/>
+      <w:lvlText w:val="•"/>
+      <w:lvlJc w:val="left"/>
+      <w:pPr>
+        <w:ind w:left="1494" w:hanging="199"/>
+      </w:pPr>
+      <w:rPr>
+        <w:rFonts w:hint="default"/>
+        <w:lang w:val="es-ES" w:eastAsia="en-US" w:bidi="ar-SA"/>
+      </w:rPr>
+    </w:lvl>
+    <w:lvl w:ilvl="2" w:tplc="43569898">
+      <w:numFmt w:val="bullet"/>
+      <w:lvlText w:val="•"/>
+      <w:lvlJc w:val="left"/>
+      <w:pPr>
+        <w:ind w:left="2608" w:hanging="199"/>
+      </w:pPr>
+      <w:rPr>
+        <w:rFonts w:hint="default"/>
+        <w:lang w:val="es-ES" w:eastAsia="en-US" w:bidi="ar-SA"/>
+      </w:rPr>
+    </w:lvl>
+    <w:lvl w:ilvl="3" w:tplc="7F4C2F76">
+      <w:numFmt w:val="bullet"/>
+      <w:lvlText w:val="•"/>
+      <w:lvlJc w:val="left"/>
+      <w:pPr>
+        <w:ind w:left="3722" w:hanging="199"/>
+      </w:pPr>
+      <w:rPr>
+        <w:rFonts w:hint="default"/>
+        <w:lang w:val="es-ES" w:eastAsia="en-US" w:bidi="ar-SA"/>
+      </w:rPr>
+    </w:lvl>
+    <w:lvl w:ilvl="4" w:tplc="249A9C88">
+      <w:numFmt w:val="bullet"/>
+      <w:lvlText w:val="•"/>
+      <w:lvlJc w:val="left"/>
+      <w:pPr>
+        <w:ind w:left="4836" w:hanging="199"/>
+      </w:pPr>
+      <w:rPr>
+        <w:rFonts w:hint="default"/>
+        <w:lang w:val="es-ES" w:eastAsia="en-US" w:bidi="ar-SA"/>
+      </w:rPr>
+    </w:lvl>
+    <w:lvl w:ilvl="5" w:tplc="AAC26326">
+      <w:numFmt w:val="bullet"/>
+      <w:lvlText w:val="•"/>
+      <w:lvlJc w:val="left"/>
+      <w:pPr>
+        <w:ind w:left="5950" w:hanging="199"/>
+      </w:pPr>
+      <w:rPr>
+        <w:rFonts w:hint="default"/>
+        <w:lang w:val="es-ES" w:eastAsia="en-US" w:bidi="ar-SA"/>
+      </w:rPr>
+    </w:lvl>
+    <w:lvl w:ilvl="6" w:tplc="47B8CF18">
+      <w:numFmt w:val="bullet"/>
+      <w:lvlText w:val="•"/>
+      <w:lvlJc w:val="left"/>
+      <w:pPr>
+        <w:ind w:left="7064" w:hanging="199"/>
+      </w:pPr>
+      <w:rPr>
+        <w:rFonts w:hint="default"/>
+        <w:lang w:val="es-ES" w:eastAsia="en-US" w:bidi="ar-SA"/>
+      </w:rPr>
+    </w:lvl>
+    <w:lvl w:ilvl="7" w:tplc="7AF478D0">
+      <w:numFmt w:val="bullet"/>
+      <w:lvlText w:val="•"/>
+      <w:lvlJc w:val="left"/>
+      <w:pPr>
+        <w:ind w:left="8178" w:hanging="199"/>
+      </w:pPr>
+      <w:rPr>
+        <w:rFonts w:hint="default"/>
+        <w:lang w:val="es-ES" w:eastAsia="en-US" w:bidi="ar-SA"/>
+      </w:rPr>
+    </w:lvl>
+    <w:lvl w:ilvl="8" w:tplc="3E444382">
+      <w:numFmt w:val="bullet"/>
+      <w:lvlText w:val="•"/>
+      <w:lvlJc w:val="left"/>
+      <w:pPr>
+        <w:ind w:left="9292" w:hanging="199"/>
+      </w:pPr>
+      <w:rPr>
+        <w:rFonts w:hint="default"/>
+        <w:lang w:val="es-ES" w:eastAsia="en-US" w:bidi="ar-SA"/>
+      </w:rPr>
+    </w:lvl>
+  </w:abstractNum>
+  <w:abstractNum w:abstractNumId="1" w15:restartNumberingAfterBreak="0">
+    <w:nsid w:val="6156605E"/>
+    <w:multiLevelType w:val="hybridMultilevel"/>
+    <w:tmpl w:val="97807D82"/>
+    <w:lvl w:ilvl="0" w:tplc="72A80D7E">
       <w:start w:val="4"/>
       <w:numFmt w:val="decimal"/>
       <w:lvlText w:val="(%1)"/>
@@ -5458,7 +5768,7 @@
         <w:lang w:val="es-ES" w:eastAsia="en-US" w:bidi="ar-SA"/>
       </w:rPr>
     </w:lvl>
-    <w:lvl w:ilvl="1" w:tplc="70840E1A">
+    <w:lvl w:ilvl="1" w:tplc="059455B0">
       <w:numFmt w:val="bullet"/>
       <w:lvlText w:val="•"/>
       <w:lvlJc w:val="left"/>
@@ -5470,7 +5780,7 @@
         <w:lang w:val="es-ES" w:eastAsia="en-US" w:bidi="ar-SA"/>
       </w:rPr>
     </w:lvl>
-    <w:lvl w:ilvl="2" w:tplc="62002748">
+    <w:lvl w:ilvl="2" w:tplc="AB986AE4">
       <w:numFmt w:val="bullet"/>
       <w:lvlText w:val="•"/>
       <w:lvlJc w:val="left"/>
@@ -5482,7 +5792,7 @@
         <w:lang w:val="es-ES" w:eastAsia="en-US" w:bidi="ar-SA"/>
       </w:rPr>
     </w:lvl>
-    <w:lvl w:ilvl="3" w:tplc="5D68D650">
+    <w:lvl w:ilvl="3" w:tplc="45DED2E2">
       <w:numFmt w:val="bullet"/>
       <w:lvlText w:val="•"/>
       <w:lvlJc w:val="left"/>
@@ -5494,7 +5804,7 @@
         <w:lang w:val="es-ES" w:eastAsia="en-US" w:bidi="ar-SA"/>
       </w:rPr>
     </w:lvl>
-    <w:lvl w:ilvl="4" w:tplc="58E237D8">
+    <w:lvl w:ilvl="4" w:tplc="AB86CE5C">
       <w:numFmt w:val="bullet"/>
       <w:lvlText w:val="•"/>
       <w:lvlJc w:val="left"/>
@@ -5506,7 +5816,7 @@
         <w:lang w:val="es-ES" w:eastAsia="en-US" w:bidi="ar-SA"/>
       </w:rPr>
     </w:lvl>
-    <w:lvl w:ilvl="5" w:tplc="B18A9F9C">
+    <w:lvl w:ilvl="5" w:tplc="1C740B7A">
       <w:numFmt w:val="bullet"/>
       <w:lvlText w:val="•"/>
       <w:lvlJc w:val="left"/>
@@ -5518,7 +5828,7 @@
         <w:lang w:val="es-ES" w:eastAsia="en-US" w:bidi="ar-SA"/>
       </w:rPr>
     </w:lvl>
-    <w:lvl w:ilvl="6" w:tplc="B03EE7FA">
+    <w:lvl w:ilvl="6" w:tplc="8CAE6054">
       <w:numFmt w:val="bullet"/>
       <w:lvlText w:val="•"/>
       <w:lvlJc w:val="left"/>
@@ -5530,7 +5840,7 @@
         <w:lang w:val="es-ES" w:eastAsia="en-US" w:bidi="ar-SA"/>
       </w:rPr>
     </w:lvl>
-    <w:lvl w:ilvl="7" w:tplc="E39EC454">
+    <w:lvl w:ilvl="7" w:tplc="DFBCBF18">
       <w:numFmt w:val="bullet"/>
       <w:lvlText w:val="•"/>
       <w:lvlJc w:val="left"/>
@@ -5542,130 +5852,7 @@
         <w:lang w:val="es-ES" w:eastAsia="en-US" w:bidi="ar-SA"/>
       </w:rPr>
     </w:lvl>
-    <w:lvl w:ilvl="8" w:tplc="5BD6B516">
-      <w:numFmt w:val="bullet"/>
-      <w:lvlText w:val="•"/>
-      <w:lvlJc w:val="left"/>
-      <w:pPr>
-        <w:ind w:left="9292" w:hanging="199"/>
-      </w:pPr>
-      <w:rPr>
-        <w:rFonts w:hint="default"/>
-        <w:lang w:val="es-ES" w:eastAsia="en-US" w:bidi="ar-SA"/>
-      </w:rPr>
-    </w:lvl>
-  </w:abstractNum>
-  <w:abstractNum w:abstractNumId="1" w15:restartNumberingAfterBreak="0">
-    <w:nsid w:val="5251298B"/>
-    <w:multiLevelType w:val="hybridMultilevel"/>
-    <w:tmpl w:val="0EA2C510"/>
-    <w:lvl w:ilvl="0" w:tplc="B13485D6">
-      <w:start w:val="1"/>
-      <w:numFmt w:val="decimal"/>
-      <w:lvlText w:val="(%1)"/>
-      <w:lvlJc w:val="left"/>
-      <w:pPr>
-        <w:ind w:left="388" w:hanging="199"/>
-        <w:jc w:val="left"/>
-      </w:pPr>
-      <w:rPr>
-        <w:rFonts w:ascii="Calibri" w:eastAsia="Calibri" w:hAnsi="Calibri" w:cs="Calibri" w:hint="default"/>
-        <w:b w:val="0"/>
-        <w:bCs w:val="0"/>
-        <w:i w:val="0"/>
-        <w:iCs w:val="0"/>
-        <w:spacing w:val="-1"/>
-        <w:w w:val="99"/>
-        <w:sz w:val="15"/>
-        <w:szCs w:val="15"/>
-        <w:lang w:val="es-ES" w:eastAsia="en-US" w:bidi="ar-SA"/>
-      </w:rPr>
-    </w:lvl>
-    <w:lvl w:ilvl="1" w:tplc="D85A829C">
-      <w:numFmt w:val="bullet"/>
-      <w:lvlText w:val="•"/>
-      <w:lvlJc w:val="left"/>
-      <w:pPr>
-        <w:ind w:left="1494" w:hanging="199"/>
-      </w:pPr>
-      <w:rPr>
-        <w:rFonts w:hint="default"/>
-        <w:lang w:val="es-ES" w:eastAsia="en-US" w:bidi="ar-SA"/>
-      </w:rPr>
-    </w:lvl>
-    <w:lvl w:ilvl="2" w:tplc="F8C678B4">
-      <w:numFmt w:val="bullet"/>
-      <w:lvlText w:val="•"/>
-      <w:lvlJc w:val="left"/>
-      <w:pPr>
-        <w:ind w:left="2608" w:hanging="199"/>
-      </w:pPr>
-      <w:rPr>
-        <w:rFonts w:hint="default"/>
-        <w:lang w:val="es-ES" w:eastAsia="en-US" w:bidi="ar-SA"/>
-      </w:rPr>
-    </w:lvl>
-    <w:lvl w:ilvl="3" w:tplc="FAAC5898">
-      <w:numFmt w:val="bullet"/>
-      <w:lvlText w:val="•"/>
-      <w:lvlJc w:val="left"/>
-      <w:pPr>
-        <w:ind w:left="3722" w:hanging="199"/>
-      </w:pPr>
-      <w:rPr>
-        <w:rFonts w:hint="default"/>
-        <w:lang w:val="es-ES" w:eastAsia="en-US" w:bidi="ar-SA"/>
-      </w:rPr>
-    </w:lvl>
-    <w:lvl w:ilvl="4" w:tplc="4308D5B6">
-      <w:numFmt w:val="bullet"/>
-      <w:lvlText w:val="•"/>
-      <w:lvlJc w:val="left"/>
-      <w:pPr>
-        <w:ind w:left="4836" w:hanging="199"/>
-      </w:pPr>
-      <w:rPr>
-        <w:rFonts w:hint="default"/>
-        <w:lang w:val="es-ES" w:eastAsia="en-US" w:bidi="ar-SA"/>
-      </w:rPr>
-    </w:lvl>
-    <w:lvl w:ilvl="5" w:tplc="5BBC9DA4">
-      <w:numFmt w:val="bullet"/>
-      <w:lvlText w:val="•"/>
-      <w:lvlJc w:val="left"/>
-      <w:pPr>
-        <w:ind w:left="5950" w:hanging="199"/>
-      </w:pPr>
-      <w:rPr>
-        <w:rFonts w:hint="default"/>
-        <w:lang w:val="es-ES" w:eastAsia="en-US" w:bidi="ar-SA"/>
-      </w:rPr>
-    </w:lvl>
-    <w:lvl w:ilvl="6" w:tplc="4D66B4D0">
-      <w:numFmt w:val="bullet"/>
-      <w:lvlText w:val="•"/>
-      <w:lvlJc w:val="left"/>
-      <w:pPr>
-        <w:ind w:left="7064" w:hanging="199"/>
-      </w:pPr>
-      <w:rPr>
-        <w:rFonts w:hint="default"/>
-        <w:lang w:val="es-ES" w:eastAsia="en-US" w:bidi="ar-SA"/>
-      </w:rPr>
-    </w:lvl>
-    <w:lvl w:ilvl="7" w:tplc="20DE625C">
-      <w:numFmt w:val="bullet"/>
-      <w:lvlText w:val="•"/>
-      <w:lvlJc w:val="left"/>
-      <w:pPr>
-        <w:ind w:left="8178" w:hanging="199"/>
-      </w:pPr>
-      <w:rPr>
-        <w:rFonts w:hint="default"/>
-        <w:lang w:val="es-ES" w:eastAsia="en-US" w:bidi="ar-SA"/>
-      </w:rPr>
-    </w:lvl>
-    <w:lvl w:ilvl="8" w:tplc="01AC838A">
+    <w:lvl w:ilvl="8" w:tplc="9DD09D0C">
       <w:numFmt w:val="bullet"/>
       <w:lvlText w:val="•"/>
       <w:lvlJc w:val="left"/>
@@ -5679,10 +5866,10 @@
     </w:lvl>
   </w:abstractNum>
   <w:num w:numId="1">
-    <w:abstractNumId w:val="0"/>
+    <w:abstractNumId w:val="1"/>
   </w:num>
   <w:num w:numId="2">
-    <w:abstractNumId w:val="1"/>
+    <w:abstractNumId w:val="0"/>
   </w:num>
 </w:numbering>
 </file>

</xml_diff>